<commit_message>
V28: correct Stage-2 qualitative record — F4 interviews never conducted
Per the author: the real record is an after-game paper questionnaire
completed by all thirty players plus intensive post-deployment
interviews with the persistent participants; the nine-question F4
protocol was designed but never administered. Appendix C (heading and
body), section 5.6 and the ToC entry corrected; the JMIR manuscript's
F4 section corrected to match. No F4 interview data are claimed
anywhere.

Co-Authored-By: Claude Fable 5 <noreply@anthropic.com>
Claude-Session: https://claude.ai/code/session_01KoT3i8geZspYBMMKVYJUTG
</commit_message>
<xml_diff>
--- a/docs/papers/Paper2_JMIR_SeriousGames_Manuscript.docx
+++ b/docs/papers/Paper2_JMIR_SeriousGames_Manuscript.docx
@@ -2464,12 +2464,12 @@
         <w:pStyle w:val="Heading2"/>
       </w:pPr>
       <w:r>
-        <w:t>F4 Interviews</w:t>
+        <w:t>Qualitative Record and the F4 Interview Protocol (Designed, Not Administered)</w:t>
       </w:r>
     </w:p>
     <w:p>
       <w:r>
-        <w:t>F4-cluster participants were interviewed within three to five days of the abandoned session about whether the decision to stop was immediate or deliberate. Table 7 shows the nine-question protocol; questions 3 and 4 test H2 and H3, question 7 tests H4, and question 9 probes domain reframing.</w:t>
+        <w:t>A nine-question semi-structured interview protocol was designed for F4-cluster participants, to probe within days of an abandoned session whether the decision to stop was immediate or deliberate (Table 7); questions 3 and 4 address H2 and H3, question 7 addresses H4, and question 9 probes domain reframing. The protocol was not administered in Stage 2 — the F4 residents' negative reaction to the experience made a research interview inappropriate at the time — and no F4 interview data exist; it is specified for the confirmatory study. The Stage-2 qualitative record comprises the after-game paper questionnaire completed by all thirty participants (the source of the satisfaction data) and post-deployment interviews with the sustained participants.</w:t>
       </w:r>
     </w:p>
     <w:p>

</xml_diff>

<commit_message>
Update all three manuscripts to under-review ethics status; fix false approval claim in JMIR manuscript
Application HSEARS20260518023 submitted, awaiting supervisor endorsement. JMIR Ethical Considerations still carried the pre-correction account (approval obtained, information sheets, caregiver-witnessed consent, fall-free eligibility) — rewritten to the as-conducted account; unverified API-logging claim removed; PIPL sentence softened to design-intent. JIKM and Paper 3 updated to cite the under-review application.

Co-Authored-By: Claude Fable 5 <noreply@anthropic.com>
Claude-Session: https://claude.ai/code/session_01KoT3i8geZspYBMMKVYJUTG
</commit_message>
<xml_diff>
--- a/docs/papers/Paper2_JMIR_SeriousGames_Manuscript.docx
+++ b/docs/papers/Paper2_JMIR_SeriousGames_Manuscript.docx
@@ -328,7 +328,7 @@
     </w:p>
     <w:p>
       <w:r>
-        <w:t>Ethical approval was obtained from the relevant institutional ethics sub-committee, and the study was conducted in accordance with the Declaration of Helsinki. Participants received written information sheets in Mandarin and Cantonese covering the research objective, session routine, data protection and the unconditional right to refuse or withdraw. For participants unable to read, a non-involved caregiver relayed the information verbally; verbal consent was recorded and signed for by the caregiver witness. Trained personnel remained present throughout sessions, with non-slip flooring and grab rails in reach. Eligibility required being fall-free for the preceding two weeks and having no medical condition deemed inappropriate by care staff; cognitive impairment affecting comprehension was grounds for exclusion. Any fall, near-fall or dizziness would trigger immediate stoppage, referral and adverse-event recording; no adverse events occurred.</w:t>
+        <w:t>The programme operates under the ethics policy of The Hong Kong Polytechnic University and in accordance with the Declaration of Helsinki; an application covering the programme, including the characterisation of the Stage-2 consent arrangement, has been submitted to the university's Human Subjects Ethics Sub-Committee and is under review (application HSEARS20260518023). The procedure is reported exactly as conducted. The facility's management, operators and nursing team approved and supported the deployment (gatekeeper consent, recorded); residents were invited by the facility to try the gamified system as a facility activity, and play was voluntary and free of charge. Participants were not told during the deployment that play formed part of a research project: announcing a fall-risk study would have re-imposed the clinical assessment frame whose behavioural effect was under study, so incomplete disclosure was integral to the design. Written consent was obtained retrospectively from the sustained participants at the close of the eight-week cycle; dropouts did not sign, and this limitation is acknowledged. Facility staff screened residents' suitability for the standing activity; trained facility personnel remained present throughout sessions, with non-slip flooring and grab rails in reach, and no adverse events occurred. All data were pseudonymised at collection.</w:t>
       </w:r>
     </w:p>
     <w:p>
@@ -341,7 +341,7 @@
     </w:p>
     <w:p>
       <w:r>
-        <w:t>Data collected comprised FRA assessment scores, play-session logs, satisfaction ratings and demographics. All data were pseudonymised at collection, with the code key stored separately and encrypted. Compliance with the Personal Information Protection Law (PIPL) [32] was maintained throughout. The AI difficulty-adaptation service received only non-identifying aggregate game parameters (obstacle density, speed, timing); no participant identities, demographics, FRA scores or other health information were transmitted to external servers, and all API requests were logged. Throughout the paper, the AI tooling is an enabling technology; the contribution is the behavioural analysis and design framework.</w:t>
+        <w:t>Data collected comprised FRA assessment scores, play-session logs, satisfaction ratings and demographics. All data were pseudonymised at collection, with the code key stored separately and encrypted. Data handling was designed to comply with the Personal Information Protection Law (PIPL) [32]. The AI difficulty-adaptation service received only non-identifying aggregate game parameters (obstacle density, speed, timing); no participant identities, demographics, FRA scores or other health information were transmitted to external servers. Throughout the paper, the AI tooling is an enabling technology; the contribution is the behavioural analysis and design framework.</w:t>
       </w:r>
     </w:p>
     <w:p>

</xml_diff>